<commit_message>
Entrega final del informe ERS -- Mesa de Ayuda Consúltenos
</commit_message>
<xml_diff>
--- a/docs/Informe_ERS_Mesa_de_Ayuda_Consultenos (1).docx
+++ b/docs/Informe_ERS_Mesa_de_Ayuda_Consultenos (1).docx
@@ -3461,43 +3461,7 @@
           <w:rPr>
             <w:rStyle w:val="Hipervnculo"/>
           </w:rPr>
-          <w:t>https://github.com/paapum</w:t>
-        </w:r>
-        <w:r>
-          <w:rPr>
-            <w:rStyle w:val="Hipervnculo"/>
-          </w:rPr>
-          <w:t>a</w:t>
-        </w:r>
-        <w:r>
-          <w:rPr>
-            <w:rStyle w:val="Hipervnculo"/>
-          </w:rPr>
-          <w:t>s</w:t>
-        </w:r>
-        <w:r>
-          <w:rPr>
-            <w:rStyle w:val="Hipervnculo"/>
-          </w:rPr>
-          <w:t>t</w:t>
-        </w:r>
-        <w:r>
-          <w:rPr>
-            <w:rStyle w:val="Hipervnculo"/>
-          </w:rPr>
-          <w:t>er/</w:t>
-        </w:r>
-        <w:r>
-          <w:rPr>
-            <w:rStyle w:val="Hipervnculo"/>
-          </w:rPr>
-          <w:t>m</w:t>
-        </w:r>
-        <w:r>
-          <w:rPr>
-            <w:rStyle w:val="Hipervnculo"/>
-          </w:rPr>
-          <w:t>esa_ayuda_consultenos.git</w:t>
+          <w:t>https://github.com/paapumaster/mesa_ayuda_consultenos.git</w:t>
         </w:r>
       </w:hyperlink>
     </w:p>
@@ -4081,12 +4045,6 @@
         <w:gridCol w:w="3700"/>
       </w:tblGrid>
       <w:tr>
-        <w:tblPrEx>
-          <w:tblCellMar>
-            <w:top w:w="0" w:type="dxa"/>
-            <w:bottom w:w="0" w:type="dxa"/>
-          </w:tblCellMar>
-        </w:tblPrEx>
         <w:trPr>
           <w:tblHeader/>
         </w:trPr>
@@ -4138,12 +4096,6 @@
         </w:tc>
       </w:tr>
       <w:tr>
-        <w:tblPrEx>
-          <w:tblCellMar>
-            <w:top w:w="0" w:type="dxa"/>
-            <w:bottom w:w="0" w:type="dxa"/>
-          </w:tblCellMar>
-        </w:tblPrEx>
         <w:tc>
           <w:tcPr>
             <w:tcW w:w="5800" w:type="dxa"/>
@@ -4180,12 +4132,6 @@
         </w:tc>
       </w:tr>
       <w:tr>
-        <w:tblPrEx>
-          <w:tblCellMar>
-            <w:top w:w="0" w:type="dxa"/>
-            <w:bottom w:w="0" w:type="dxa"/>
-          </w:tblCellMar>
-        </w:tblPrEx>
         <w:tc>
           <w:tcPr>
             <w:tcW w:w="5800" w:type="dxa"/>
@@ -4222,12 +4168,6 @@
         </w:tc>
       </w:tr>
       <w:tr>
-        <w:tblPrEx>
-          <w:tblCellMar>
-            <w:top w:w="0" w:type="dxa"/>
-            <w:bottom w:w="0" w:type="dxa"/>
-          </w:tblCellMar>
-        </w:tblPrEx>
         <w:tc>
           <w:tcPr>
             <w:tcW w:w="5800" w:type="dxa"/>
@@ -4264,12 +4204,6 @@
         </w:tc>
       </w:tr>
       <w:tr>
-        <w:tblPrEx>
-          <w:tblCellMar>
-            <w:top w:w="0" w:type="dxa"/>
-            <w:bottom w:w="0" w:type="dxa"/>
-          </w:tblCellMar>
-        </w:tblPrEx>
         <w:tc>
           <w:tcPr>
             <w:tcW w:w="5800" w:type="dxa"/>
@@ -4306,12 +4240,6 @@
         </w:tc>
       </w:tr>
       <w:tr>
-        <w:tblPrEx>
-          <w:tblCellMar>
-            <w:top w:w="0" w:type="dxa"/>
-            <w:bottom w:w="0" w:type="dxa"/>
-          </w:tblCellMar>
-        </w:tblPrEx>
         <w:tc>
           <w:tcPr>
             <w:tcW w:w="5800" w:type="dxa"/>
@@ -4348,12 +4276,6 @@
         </w:tc>
       </w:tr>
       <w:tr>
-        <w:tblPrEx>
-          <w:tblCellMar>
-            <w:top w:w="0" w:type="dxa"/>
-            <w:bottom w:w="0" w:type="dxa"/>
-          </w:tblCellMar>
-        </w:tblPrEx>
         <w:tc>
           <w:tcPr>
             <w:tcW w:w="5800" w:type="dxa"/>
@@ -4390,12 +4312,6 @@
         </w:tc>
       </w:tr>
       <w:tr>
-        <w:tblPrEx>
-          <w:tblCellMar>
-            <w:top w:w="0" w:type="dxa"/>
-            <w:bottom w:w="0" w:type="dxa"/>
-          </w:tblCellMar>
-        </w:tblPrEx>
         <w:tc>
           <w:tcPr>
             <w:tcW w:w="5800" w:type="dxa"/>
@@ -4432,12 +4348,6 @@
         </w:tc>
       </w:tr>
       <w:tr>
-        <w:tblPrEx>
-          <w:tblCellMar>
-            <w:top w:w="0" w:type="dxa"/>
-            <w:bottom w:w="0" w:type="dxa"/>
-          </w:tblCellMar>
-        </w:tblPrEx>
         <w:tc>
           <w:tcPr>
             <w:tcW w:w="5800" w:type="dxa"/>
@@ -4474,12 +4384,6 @@
         </w:tc>
       </w:tr>
       <w:tr>
-        <w:tblPrEx>
-          <w:tblCellMar>
-            <w:top w:w="0" w:type="dxa"/>
-            <w:bottom w:w="0" w:type="dxa"/>
-          </w:tblCellMar>
-        </w:tblPrEx>
         <w:tc>
           <w:tcPr>
             <w:tcW w:w="5800" w:type="dxa"/>
@@ -4516,12 +4420,6 @@
         </w:tc>
       </w:tr>
       <w:tr>
-        <w:tblPrEx>
-          <w:tblCellMar>
-            <w:top w:w="0" w:type="dxa"/>
-            <w:bottom w:w="0" w:type="dxa"/>
-          </w:tblCellMar>
-        </w:tblPrEx>
         <w:tc>
           <w:tcPr>
             <w:tcW w:w="5800" w:type="dxa"/>
@@ -4975,6 +4873,9 @@
         <w:spacing w:before="200" w:after="100"/>
       </w:pPr>
       <w:r>
+        <w:rPr>
+          <w:noProof/>
+        </w:rPr>
         <w:drawing>
           <wp:inline distT="0" distB="0" distL="0" distR="0" wp14:anchorId="5C8DCA9C" wp14:editId="3B3E9EC5">
             <wp:extent cx="5731510" cy="3608070"/>
@@ -7272,9 +7173,6 @@
           <w:right w:val="single" w:sz="4" w:space="8" w:color="CCCCCC"/>
         </w:pBdr>
         <w:shd w:val="clear" w:color="auto" w:fill="F5F5F5"/>
-        <w:rPr>
-          <w:lang w:val="en-US"/>
-        </w:rPr>
       </w:pPr>
       <w:r>
         <w:rPr>
@@ -7293,7 +7191,6 @@
           <w:color w:val="1F1F1F"/>
           <w:sz w:val="18"/>
           <w:szCs w:val="18"/>
-          <w:lang w:val="en-US"/>
         </w:rPr>
         <w:t>nombre_tipo</w:t>
       </w:r>
@@ -7304,7 +7201,6 @@
           <w:color w:val="1F1F1F"/>
           <w:sz w:val="18"/>
           <w:szCs w:val="18"/>
-          <w:lang w:val="en-US"/>
         </w:rPr>
         <w:t xml:space="preserve"> </w:t>
       </w:r>
@@ -7315,7 +7211,6 @@
           <w:color w:val="1F1F1F"/>
           <w:sz w:val="18"/>
           <w:szCs w:val="18"/>
-          <w:lang w:val="en-US"/>
         </w:rPr>
         <w:t>VARCHAR(</w:t>
       </w:r>
@@ -7326,7 +7221,6 @@
           <w:color w:val="1F1F1F"/>
           <w:sz w:val="18"/>
           <w:szCs w:val="18"/>
-          <w:lang w:val="en-US"/>
         </w:rPr>
         <w:t>50) NOT NULL UNIQUE,</w:t>
       </w:r>
@@ -7348,7 +7242,6 @@
           <w:color w:val="1F1F1F"/>
           <w:sz w:val="18"/>
           <w:szCs w:val="18"/>
-          <w:lang w:val="en-US"/>
         </w:rPr>
         <w:t xml:space="preserve">    </w:t>
       </w:r>
@@ -7922,6 +7815,9 @@
           <w:right w:val="single" w:sz="4" w:space="8" w:color="CCCCCC"/>
         </w:pBdr>
         <w:shd w:val="clear" w:color="auto" w:fill="F5F5F5"/>
+        <w:rPr>
+          <w:lang w:val="en-US"/>
+        </w:rPr>
       </w:pPr>
       <w:r>
         <w:rPr>
@@ -7939,6 +7835,7 @@
           <w:color w:val="1F1F1F"/>
           <w:sz w:val="18"/>
           <w:szCs w:val="18"/>
+          <w:lang w:val="en-US"/>
         </w:rPr>
         <w:t>rut_usuario</w:t>
       </w:r>
@@ -7949,6 +7846,7 @@
           <w:color w:val="1F1F1F"/>
           <w:sz w:val="18"/>
           <w:szCs w:val="18"/>
+          <w:lang w:val="en-US"/>
         </w:rPr>
         <w:t xml:space="preserve"> </w:t>
       </w:r>
@@ -7959,6 +7857,7 @@
           <w:color w:val="1F1F1F"/>
           <w:sz w:val="18"/>
           <w:szCs w:val="18"/>
+          <w:lang w:val="en-US"/>
         </w:rPr>
         <w:t>VARCHAR(</w:t>
       </w:r>
@@ -7969,6 +7868,7 @@
           <w:color w:val="1F1F1F"/>
           <w:sz w:val="18"/>
           <w:szCs w:val="18"/>
+          <w:lang w:val="en-US"/>
         </w:rPr>
         <w:t>12) NOT NULL UNIQUE,</w:t>
       </w:r>
@@ -7987,6 +7887,7 @@
           <w:color w:val="1F1F1F"/>
           <w:sz w:val="18"/>
           <w:szCs w:val="18"/>
+          <w:lang w:val="en-US"/>
         </w:rPr>
         <w:t xml:space="preserve">    </w:t>
       </w:r>
@@ -8038,15 +7939,40 @@
           <w:right w:val="single" w:sz="4" w:space="8" w:color="CCCCCC"/>
         </w:pBdr>
         <w:shd w:val="clear" w:color="auto" w:fill="F5F5F5"/>
-      </w:pPr>
-      <w:r>
-        <w:rPr>
-          <w:rFonts w:ascii="Consolas" w:eastAsia="Consolas" w:hAnsi="Consolas" w:cs="Consolas"/>
-          <w:color w:val="1F1F1F"/>
-          <w:sz w:val="18"/>
-          <w:szCs w:val="18"/>
-        </w:rPr>
-        <w:t xml:space="preserve">    correo </w:t>
+        <w:rPr>
+          <w:lang w:val="en-US"/>
+        </w:rPr>
+      </w:pPr>
+      <w:r>
+        <w:rPr>
+          <w:rFonts w:ascii="Consolas" w:eastAsia="Consolas" w:hAnsi="Consolas" w:cs="Consolas"/>
+          <w:color w:val="1F1F1F"/>
+          <w:sz w:val="18"/>
+          <w:szCs w:val="18"/>
+        </w:rPr>
+        <w:t xml:space="preserve">    </w:t>
+      </w:r>
+      <w:proofErr w:type="spellStart"/>
+      <w:r>
+        <w:rPr>
+          <w:rFonts w:ascii="Consolas" w:eastAsia="Consolas" w:hAnsi="Consolas" w:cs="Consolas"/>
+          <w:color w:val="1F1F1F"/>
+          <w:sz w:val="18"/>
+          <w:szCs w:val="18"/>
+          <w:lang w:val="en-US"/>
+        </w:rPr>
+        <w:t>correo</w:t>
+      </w:r>
+      <w:proofErr w:type="spellEnd"/>
+      <w:r>
+        <w:rPr>
+          <w:rFonts w:ascii="Consolas" w:eastAsia="Consolas" w:hAnsi="Consolas" w:cs="Consolas"/>
+          <w:color w:val="1F1F1F"/>
+          <w:sz w:val="18"/>
+          <w:szCs w:val="18"/>
+          <w:lang w:val="en-US"/>
+        </w:rPr>
+        <w:t xml:space="preserve"> </w:t>
       </w:r>
       <w:proofErr w:type="gramStart"/>
       <w:r>
@@ -8055,6 +7981,7 @@
           <w:color w:val="1F1F1F"/>
           <w:sz w:val="18"/>
           <w:szCs w:val="18"/>
+          <w:lang w:val="en-US"/>
         </w:rPr>
         <w:t>VARCHAR(</w:t>
       </w:r>
@@ -8065,6 +7992,7 @@
           <w:color w:val="1F1F1F"/>
           <w:sz w:val="18"/>
           <w:szCs w:val="18"/>
+          <w:lang w:val="en-US"/>
         </w:rPr>
         <w:t>100) NOT NULL UNIQUE,</w:t>
       </w:r>
@@ -8086,6 +8014,7 @@
           <w:color w:val="1F1F1F"/>
           <w:sz w:val="18"/>
           <w:szCs w:val="18"/>
+          <w:lang w:val="en-US"/>
         </w:rPr>
         <w:t xml:space="preserve">    </w:t>
       </w:r>
@@ -14825,6 +14754,12 @@
           <w:right w:val="single" w:sz="4" w:space="8" w:color="CCCCCC"/>
         </w:pBdr>
         <w:shd w:val="clear" w:color="auto" w:fill="F5F5F5"/>
+        <w:rPr>
+          <w:rFonts w:ascii="Consolas" w:eastAsia="Consolas" w:hAnsi="Consolas" w:cs="Consolas"/>
+          <w:color w:val="1F1F1F"/>
+          <w:sz w:val="18"/>
+          <w:szCs w:val="18"/>
+        </w:rPr>
       </w:pPr>
       <w:r>
         <w:rPr>
@@ -14836,9 +14771,242 @@
         <w:t>@enduml</w:t>
       </w:r>
     </w:p>
+    <w:p>
+      <w:pPr>
+        <w:pBdr>
+          <w:left w:val="single" w:sz="4" w:space="8" w:color="CCCCCC"/>
+          <w:bottom w:val="single" w:sz="4" w:space="4" w:color="CCCCCC"/>
+          <w:right w:val="single" w:sz="4" w:space="8" w:color="CCCCCC"/>
+        </w:pBdr>
+        <w:shd w:val="clear" w:color="auto" w:fill="F5F5F5"/>
+      </w:pPr>
+    </w:p>
+    <w:p/>
+    <w:p/>
+    <w:p/>
+    <w:p/>
+    <w:p/>
+    <w:p/>
+    <w:p/>
+    <w:p/>
+    <w:p/>
+    <w:p/>
+    <w:p>
+      <w:r>
+        <w:rPr>
+          <w:b/>
+          <w:bCs/>
+        </w:rPr>
+        <w:lastRenderedPageBreak/>
+        <w:t>Referencias</w:t>
+      </w:r>
+    </w:p>
+    <w:p>
+      <w:pPr>
+        <w:numPr>
+          <w:ilvl w:val="0"/>
+          <w:numId w:val="3"/>
+        </w:numPr>
+      </w:pPr>
+      <w:r>
+        <w:rPr>
+          <w:lang w:val="en-US"/>
+        </w:rPr>
+        <w:t xml:space="preserve">IEEE Computer Society. (1998). </w:t>
+      </w:r>
+      <w:r>
+        <w:rPr>
+          <w:i/>
+          <w:iCs/>
+          <w:lang w:val="en-US"/>
+        </w:rPr>
+        <w:t>IEEE Recommended Practice for Software Requirements Specifications</w:t>
+      </w:r>
+      <w:r>
+        <w:rPr>
+          <w:lang w:val="en-US"/>
+        </w:rPr>
+        <w:t xml:space="preserve"> (IEEE Std 830-1998). </w:t>
+      </w:r>
+      <w:proofErr w:type="spellStart"/>
+      <w:r>
+        <w:t>Institute</w:t>
+      </w:r>
+      <w:proofErr w:type="spellEnd"/>
+      <w:r>
+        <w:t xml:space="preserve"> </w:t>
+      </w:r>
+      <w:proofErr w:type="spellStart"/>
+      <w:r>
+        <w:t>of</w:t>
+      </w:r>
+      <w:proofErr w:type="spellEnd"/>
+      <w:r>
+        <w:t xml:space="preserve"> </w:t>
+      </w:r>
+      <w:proofErr w:type="spellStart"/>
+      <w:r>
+        <w:t>Electrical</w:t>
+      </w:r>
+      <w:proofErr w:type="spellEnd"/>
+      <w:r>
+        <w:t xml:space="preserve"> and </w:t>
+      </w:r>
+      <w:proofErr w:type="spellStart"/>
+      <w:r>
+        <w:t>Electronics</w:t>
+      </w:r>
+      <w:proofErr w:type="spellEnd"/>
+      <w:r>
+        <w:t xml:space="preserve"> </w:t>
+      </w:r>
+      <w:proofErr w:type="spellStart"/>
+      <w:r>
+        <w:t>Engineers</w:t>
+      </w:r>
+      <w:proofErr w:type="spellEnd"/>
+      <w:r>
+        <w:t>.</w:t>
+      </w:r>
+    </w:p>
+    <w:p>
+      <w:pPr>
+        <w:numPr>
+          <w:ilvl w:val="0"/>
+          <w:numId w:val="3"/>
+        </w:numPr>
+      </w:pPr>
+      <w:r>
+        <w:t xml:space="preserve">INACAP. (2026). </w:t>
+      </w:r>
+      <w:r>
+        <w:rPr>
+          <w:i/>
+          <w:iCs/>
+        </w:rPr>
+        <w:t>Guía de Apoyo y Material Docente: Asignatura Metodología de Desarrollo Ágil</w:t>
+      </w:r>
+      <w:r>
+        <w:t>. Área Informática y Telecomunicaciones, INACAP.</w:t>
+      </w:r>
+    </w:p>
+    <w:p>
+      <w:pPr>
+        <w:numPr>
+          <w:ilvl w:val="0"/>
+          <w:numId w:val="3"/>
+        </w:numPr>
+      </w:pPr>
+      <w:r>
+        <w:rPr>
+          <w:lang w:val="en-US"/>
+        </w:rPr>
+        <w:t xml:space="preserve">PlantUML. (2026). </w:t>
+      </w:r>
+      <w:r>
+        <w:rPr>
+          <w:i/>
+          <w:iCs/>
+          <w:lang w:val="en-US"/>
+        </w:rPr>
+        <w:t>PlantUML Language Reference Guide</w:t>
+      </w:r>
+      <w:r>
+        <w:rPr>
+          <w:lang w:val="en-US"/>
+        </w:rPr>
+        <w:t xml:space="preserve">. </w:t>
+      </w:r>
+      <w:hyperlink r:id="rId11" w:tgtFrame="_blank" w:history="1">
+        <w:r>
+          <w:rPr>
+            <w:rStyle w:val="Hipervnculo"/>
+          </w:rPr>
+          <w:t>https://plantuml.com/</w:t>
+        </w:r>
+      </w:hyperlink>
+    </w:p>
+    <w:p>
+      <w:pPr>
+        <w:numPr>
+          <w:ilvl w:val="0"/>
+          <w:numId w:val="3"/>
+        </w:numPr>
+      </w:pPr>
+      <w:r>
+        <w:rPr>
+          <w:lang w:val="en-US"/>
+        </w:rPr>
+        <w:t xml:space="preserve">PostgreSQL Global Development Group. (2026). </w:t>
+      </w:r>
+      <w:r>
+        <w:rPr>
+          <w:i/>
+          <w:iCs/>
+          <w:lang w:val="en-US"/>
+        </w:rPr>
+        <w:t>PostgreSQL Documentation</w:t>
+      </w:r>
+      <w:r>
+        <w:rPr>
+          <w:lang w:val="en-US"/>
+        </w:rPr>
+        <w:t xml:space="preserve">. </w:t>
+      </w:r>
+      <w:hyperlink r:id="rId12" w:tgtFrame="_blank" w:history="1">
+        <w:r>
+          <w:rPr>
+            <w:rStyle w:val="Hipervnculo"/>
+          </w:rPr>
+          <w:t>https://www.postgresql.org/docs/</w:t>
+        </w:r>
+      </w:hyperlink>
+    </w:p>
+    <w:p>
+      <w:pPr>
+        <w:numPr>
+          <w:ilvl w:val="0"/>
+          <w:numId w:val="3"/>
+        </w:numPr>
+      </w:pPr>
+      <w:r>
+        <w:t xml:space="preserve">Pressman, R. S. (2010). </w:t>
+      </w:r>
+      <w:r>
+        <w:rPr>
+          <w:i/>
+          <w:iCs/>
+        </w:rPr>
+        <w:t>Ingeniería del Software: Un enfoque práctico</w:t>
+      </w:r>
+      <w:r>
+        <w:t xml:space="preserve"> (7.ª ed.). McGraw-Hill.</w:t>
+      </w:r>
+    </w:p>
+    <w:p/>
+    <w:p>
+      <w:pPr>
+        <w:jc w:val="right"/>
+      </w:pPr>
+    </w:p>
+    <w:p>
+      <w:pPr>
+        <w:jc w:val="right"/>
+      </w:pPr>
+    </w:p>
+    <w:p>
+      <w:pPr>
+        <w:jc w:val="right"/>
+      </w:pPr>
+    </w:p>
+    <w:p>
+      <w:pPr>
+        <w:jc w:val="right"/>
+      </w:pPr>
+    </w:p>
     <w:sectPr>
-      <w:headerReference w:type="default" r:id="rId11"/>
-      <w:footerReference w:type="default" r:id="rId12"/>
+      <w:headerReference w:type="default" r:id="rId13"/>
+      <w:footerReference w:type="default" r:id="rId14"/>
       <w:pgSz w:w="11906" w:h="16838"/>
       <w:pgMar w:top="1440" w:right="1440" w:bottom="1440" w:left="1440" w:header="708" w:footer="708" w:gutter="0"/>
       <w:cols w:space="720"/>
@@ -15020,6 +15188,304 @@
 <file path=word/numbering.xml><?xml version="1.0" encoding="utf-8"?>
 <w:numbering xmlns:wpc="http://schemas.microsoft.com/office/word/2010/wordprocessingCanvas" xmlns:cx="http://schemas.microsoft.com/office/drawing/2014/chartex" xmlns:cx1="http://schemas.microsoft.com/office/drawing/2015/9/8/chartex" xmlns:cx2="http://schemas.microsoft.com/office/drawing/2015/10/21/chartex" xmlns:cx3="http://schemas.microsoft.com/office/drawing/2016/5/9/chartex" xmlns:cx4="http://schemas.microsoft.com/office/drawing/2016/5/10/chartex" xmlns:cx5="http://schemas.microsoft.com/office/drawing/2016/5/11/chartex" xmlns:cx6="http://schemas.microsoft.com/office/drawing/2016/5/12/chartex" xmlns:cx7="http://schemas.microsoft.com/office/drawing/2016/5/13/chartex" xmlns:cx8="http://schemas.microsoft.com/office/drawing/2016/5/14/chartex" xmlns:mc="http://schemas.openxmlformats.org/markup-compatibility/2006" xmlns:aink="http://schemas.microsoft.com/office/drawing/2016/ink" xmlns:am3d="http://schemas.microsoft.com/office/drawing/2017/model3d" xmlns:o="urn:schemas-microsoft-com:office:office" xmlns:oel="http://schemas.microsoft.com/office/2019/extlst" xmlns:r="http://schemas.openxmlformats.org/officeDocument/2006/relationships" xmlns:m="http://schemas.openxmlformats.org/officeDocument/2006/math" xmlns:v="urn:schemas-microsoft-com:vml" xmlns:wp14="http://schemas.microsoft.com/office/word/2010/wordprocessingDrawing" xmlns:wp="http://schemas.openxmlformats.org/drawingml/2006/wordprocessingDrawing" xmlns:w10="urn:schemas-microsoft-com:office:word" xmlns:w="http://schemas.openxmlformats.org/wordprocessingml/2006/main" xmlns:w14="http://schemas.microsoft.com/office/word/2010/wordml" xmlns:w15="http://schemas.microsoft.com/office/word/2012/wordml" xmlns:w16cex="http://schemas.microsoft.com/office/word/2018/wordml/cex" xmlns:w16cid="http://schemas.microsoft.com/office/word/2016/wordml/cid" xmlns:w16="http://schemas.microsoft.com/office/word/2018/wordml" xmlns:w16du="http://schemas.microsoft.com/office/word/2023/wordml/word16du" xmlns:w16sdtdh="http://schemas.microsoft.com/office/word/2020/wordml/sdtdatahash" xmlns:w16sdtfl="http://schemas.microsoft.com/office/word/2024/wordml/sdtformatlock" xmlns:w16se="http://schemas.microsoft.com/office/word/2015/wordml/symex" xmlns:wpg="http://schemas.microsoft.com/office/word/2010/wordprocessingGroup" xmlns:wpi="http://schemas.microsoft.com/office/word/2010/wordprocessingInk" xmlns:wne="http://schemas.microsoft.com/office/word/2006/wordml" xmlns:wps="http://schemas.microsoft.com/office/word/2010/wordprocessingShape" mc:Ignorable="w14 w15 w16se w16cid w16 w16cex w16sdtdh w16sdtfl w16du wp14">
   <w:abstractNum w:abstractNumId="0" w15:restartNumberingAfterBreak="0">
+    <w:nsid w:val="01E96EE3"/>
+    <w:multiLevelType w:val="multilevel"/>
+    <w:tmpl w:val="B728E97E"/>
+    <w:lvl w:ilvl="0">
+      <w:start w:val="1"/>
+      <w:numFmt w:val="bullet"/>
+      <w:lvlText w:val=""/>
+      <w:lvlJc w:val="left"/>
+      <w:pPr>
+        <w:tabs>
+          <w:tab w:val="num" w:pos="720"/>
+        </w:tabs>
+        <w:ind w:left="720" w:hanging="360"/>
+      </w:pPr>
+      <w:rPr>
+        <w:rFonts w:ascii="Symbol" w:hAnsi="Symbol" w:hint="default"/>
+        <w:sz w:val="20"/>
+      </w:rPr>
+    </w:lvl>
+    <w:lvl w:ilvl="1" w:tentative="1">
+      <w:start w:val="1"/>
+      <w:numFmt w:val="bullet"/>
+      <w:lvlText w:val="o"/>
+      <w:lvlJc w:val="left"/>
+      <w:pPr>
+        <w:tabs>
+          <w:tab w:val="num" w:pos="1440"/>
+        </w:tabs>
+        <w:ind w:left="1440" w:hanging="360"/>
+      </w:pPr>
+      <w:rPr>
+        <w:rFonts w:ascii="Courier New" w:hAnsi="Courier New" w:hint="default"/>
+        <w:sz w:val="20"/>
+      </w:rPr>
+    </w:lvl>
+    <w:lvl w:ilvl="2" w:tentative="1">
+      <w:start w:val="1"/>
+      <w:numFmt w:val="bullet"/>
+      <w:lvlText w:val=""/>
+      <w:lvlJc w:val="left"/>
+      <w:pPr>
+        <w:tabs>
+          <w:tab w:val="num" w:pos="2160"/>
+        </w:tabs>
+        <w:ind w:left="2160" w:hanging="360"/>
+      </w:pPr>
+      <w:rPr>
+        <w:rFonts w:ascii="Wingdings" w:hAnsi="Wingdings" w:hint="default"/>
+        <w:sz w:val="20"/>
+      </w:rPr>
+    </w:lvl>
+    <w:lvl w:ilvl="3" w:tentative="1">
+      <w:start w:val="1"/>
+      <w:numFmt w:val="bullet"/>
+      <w:lvlText w:val=""/>
+      <w:lvlJc w:val="left"/>
+      <w:pPr>
+        <w:tabs>
+          <w:tab w:val="num" w:pos="2880"/>
+        </w:tabs>
+        <w:ind w:left="2880" w:hanging="360"/>
+      </w:pPr>
+      <w:rPr>
+        <w:rFonts w:ascii="Wingdings" w:hAnsi="Wingdings" w:hint="default"/>
+        <w:sz w:val="20"/>
+      </w:rPr>
+    </w:lvl>
+    <w:lvl w:ilvl="4" w:tentative="1">
+      <w:start w:val="1"/>
+      <w:numFmt w:val="bullet"/>
+      <w:lvlText w:val=""/>
+      <w:lvlJc w:val="left"/>
+      <w:pPr>
+        <w:tabs>
+          <w:tab w:val="num" w:pos="3600"/>
+        </w:tabs>
+        <w:ind w:left="3600" w:hanging="360"/>
+      </w:pPr>
+      <w:rPr>
+        <w:rFonts w:ascii="Wingdings" w:hAnsi="Wingdings" w:hint="default"/>
+        <w:sz w:val="20"/>
+      </w:rPr>
+    </w:lvl>
+    <w:lvl w:ilvl="5" w:tentative="1">
+      <w:start w:val="1"/>
+      <w:numFmt w:val="bullet"/>
+      <w:lvlText w:val=""/>
+      <w:lvlJc w:val="left"/>
+      <w:pPr>
+        <w:tabs>
+          <w:tab w:val="num" w:pos="4320"/>
+        </w:tabs>
+        <w:ind w:left="4320" w:hanging="360"/>
+      </w:pPr>
+      <w:rPr>
+        <w:rFonts w:ascii="Wingdings" w:hAnsi="Wingdings" w:hint="default"/>
+        <w:sz w:val="20"/>
+      </w:rPr>
+    </w:lvl>
+    <w:lvl w:ilvl="6" w:tentative="1">
+      <w:start w:val="1"/>
+      <w:numFmt w:val="bullet"/>
+      <w:lvlText w:val=""/>
+      <w:lvlJc w:val="left"/>
+      <w:pPr>
+        <w:tabs>
+          <w:tab w:val="num" w:pos="5040"/>
+        </w:tabs>
+        <w:ind w:left="5040" w:hanging="360"/>
+      </w:pPr>
+      <w:rPr>
+        <w:rFonts w:ascii="Wingdings" w:hAnsi="Wingdings" w:hint="default"/>
+        <w:sz w:val="20"/>
+      </w:rPr>
+    </w:lvl>
+    <w:lvl w:ilvl="7" w:tentative="1">
+      <w:start w:val="1"/>
+      <w:numFmt w:val="bullet"/>
+      <w:lvlText w:val=""/>
+      <w:lvlJc w:val="left"/>
+      <w:pPr>
+        <w:tabs>
+          <w:tab w:val="num" w:pos="5760"/>
+        </w:tabs>
+        <w:ind w:left="5760" w:hanging="360"/>
+      </w:pPr>
+      <w:rPr>
+        <w:rFonts w:ascii="Wingdings" w:hAnsi="Wingdings" w:hint="default"/>
+        <w:sz w:val="20"/>
+      </w:rPr>
+    </w:lvl>
+    <w:lvl w:ilvl="8" w:tentative="1">
+      <w:start w:val="1"/>
+      <w:numFmt w:val="bullet"/>
+      <w:lvlText w:val=""/>
+      <w:lvlJc w:val="left"/>
+      <w:pPr>
+        <w:tabs>
+          <w:tab w:val="num" w:pos="6480"/>
+        </w:tabs>
+        <w:ind w:left="6480" w:hanging="360"/>
+      </w:pPr>
+      <w:rPr>
+        <w:rFonts w:ascii="Wingdings" w:hAnsi="Wingdings" w:hint="default"/>
+        <w:sz w:val="20"/>
+      </w:rPr>
+    </w:lvl>
+  </w:abstractNum>
+  <w:abstractNum w:abstractNumId="1" w15:restartNumberingAfterBreak="0">
+    <w:nsid w:val="0886370A"/>
+    <w:multiLevelType w:val="multilevel"/>
+    <w:tmpl w:val="8BACE2AE"/>
+    <w:lvl w:ilvl="0">
+      <w:start w:val="1"/>
+      <w:numFmt w:val="bullet"/>
+      <w:lvlText w:val=""/>
+      <w:lvlJc w:val="left"/>
+      <w:pPr>
+        <w:tabs>
+          <w:tab w:val="num" w:pos="720"/>
+        </w:tabs>
+        <w:ind w:left="720" w:hanging="360"/>
+      </w:pPr>
+      <w:rPr>
+        <w:rFonts w:ascii="Symbol" w:hAnsi="Symbol" w:hint="default"/>
+        <w:sz w:val="20"/>
+      </w:rPr>
+    </w:lvl>
+    <w:lvl w:ilvl="1" w:tentative="1">
+      <w:start w:val="1"/>
+      <w:numFmt w:val="bullet"/>
+      <w:lvlText w:val="o"/>
+      <w:lvlJc w:val="left"/>
+      <w:pPr>
+        <w:tabs>
+          <w:tab w:val="num" w:pos="1440"/>
+        </w:tabs>
+        <w:ind w:left="1440" w:hanging="360"/>
+      </w:pPr>
+      <w:rPr>
+        <w:rFonts w:ascii="Courier New" w:hAnsi="Courier New" w:hint="default"/>
+        <w:sz w:val="20"/>
+      </w:rPr>
+    </w:lvl>
+    <w:lvl w:ilvl="2" w:tentative="1">
+      <w:start w:val="1"/>
+      <w:numFmt w:val="bullet"/>
+      <w:lvlText w:val=""/>
+      <w:lvlJc w:val="left"/>
+      <w:pPr>
+        <w:tabs>
+          <w:tab w:val="num" w:pos="2160"/>
+        </w:tabs>
+        <w:ind w:left="2160" w:hanging="360"/>
+      </w:pPr>
+      <w:rPr>
+        <w:rFonts w:ascii="Wingdings" w:hAnsi="Wingdings" w:hint="default"/>
+        <w:sz w:val="20"/>
+      </w:rPr>
+    </w:lvl>
+    <w:lvl w:ilvl="3" w:tentative="1">
+      <w:start w:val="1"/>
+      <w:numFmt w:val="bullet"/>
+      <w:lvlText w:val=""/>
+      <w:lvlJc w:val="left"/>
+      <w:pPr>
+        <w:tabs>
+          <w:tab w:val="num" w:pos="2880"/>
+        </w:tabs>
+        <w:ind w:left="2880" w:hanging="360"/>
+      </w:pPr>
+      <w:rPr>
+        <w:rFonts w:ascii="Wingdings" w:hAnsi="Wingdings" w:hint="default"/>
+        <w:sz w:val="20"/>
+      </w:rPr>
+    </w:lvl>
+    <w:lvl w:ilvl="4" w:tentative="1">
+      <w:start w:val="1"/>
+      <w:numFmt w:val="bullet"/>
+      <w:lvlText w:val=""/>
+      <w:lvlJc w:val="left"/>
+      <w:pPr>
+        <w:tabs>
+          <w:tab w:val="num" w:pos="3600"/>
+        </w:tabs>
+        <w:ind w:left="3600" w:hanging="360"/>
+      </w:pPr>
+      <w:rPr>
+        <w:rFonts w:ascii="Wingdings" w:hAnsi="Wingdings" w:hint="default"/>
+        <w:sz w:val="20"/>
+      </w:rPr>
+    </w:lvl>
+    <w:lvl w:ilvl="5" w:tentative="1">
+      <w:start w:val="1"/>
+      <w:numFmt w:val="bullet"/>
+      <w:lvlText w:val=""/>
+      <w:lvlJc w:val="left"/>
+      <w:pPr>
+        <w:tabs>
+          <w:tab w:val="num" w:pos="4320"/>
+        </w:tabs>
+        <w:ind w:left="4320" w:hanging="360"/>
+      </w:pPr>
+      <w:rPr>
+        <w:rFonts w:ascii="Wingdings" w:hAnsi="Wingdings" w:hint="default"/>
+        <w:sz w:val="20"/>
+      </w:rPr>
+    </w:lvl>
+    <w:lvl w:ilvl="6" w:tentative="1">
+      <w:start w:val="1"/>
+      <w:numFmt w:val="bullet"/>
+      <w:lvlText w:val=""/>
+      <w:lvlJc w:val="left"/>
+      <w:pPr>
+        <w:tabs>
+          <w:tab w:val="num" w:pos="5040"/>
+        </w:tabs>
+        <w:ind w:left="5040" w:hanging="360"/>
+      </w:pPr>
+      <w:rPr>
+        <w:rFonts w:ascii="Wingdings" w:hAnsi="Wingdings" w:hint="default"/>
+        <w:sz w:val="20"/>
+      </w:rPr>
+    </w:lvl>
+    <w:lvl w:ilvl="7" w:tentative="1">
+      <w:start w:val="1"/>
+      <w:numFmt w:val="bullet"/>
+      <w:lvlText w:val=""/>
+      <w:lvlJc w:val="left"/>
+      <w:pPr>
+        <w:tabs>
+          <w:tab w:val="num" w:pos="5760"/>
+        </w:tabs>
+        <w:ind w:left="5760" w:hanging="360"/>
+      </w:pPr>
+      <w:rPr>
+        <w:rFonts w:ascii="Wingdings" w:hAnsi="Wingdings" w:hint="default"/>
+        <w:sz w:val="20"/>
+      </w:rPr>
+    </w:lvl>
+    <w:lvl w:ilvl="8" w:tentative="1">
+      <w:start w:val="1"/>
+      <w:numFmt w:val="bullet"/>
+      <w:lvlText w:val=""/>
+      <w:lvlJc w:val="left"/>
+      <w:pPr>
+        <w:tabs>
+          <w:tab w:val="num" w:pos="6480"/>
+        </w:tabs>
+        <w:ind w:left="6480" w:hanging="360"/>
+      </w:pPr>
+      <w:rPr>
+        <w:rFonts w:ascii="Wingdings" w:hAnsi="Wingdings" w:hint="default"/>
+        <w:sz w:val="20"/>
+      </w:rPr>
+    </w:lvl>
+  </w:abstractNum>
+  <w:abstractNum w:abstractNumId="2" w15:restartNumberingAfterBreak="0">
     <w:nsid w:val="28224D14"/>
     <w:multiLevelType w:val="hybridMultilevel"/>
     <w:tmpl w:val="893673DE"/>
@@ -15106,10 +15572,16 @@
     </w:lvl>
   </w:abstractNum>
   <w:num w:numId="1" w16cid:durableId="1943994537">
-    <w:abstractNumId w:val="0"/>
+    <w:abstractNumId w:val="2"/>
     <w:lvlOverride w:ilvl="0">
       <w:startOverride w:val="1"/>
     </w:lvlOverride>
+  </w:num>
+  <w:num w:numId="2" w16cid:durableId="1685327438">
+    <w:abstractNumId w:val="1"/>
+  </w:num>
+  <w:num w:numId="3" w16cid:durableId="208610747">
+    <w:abstractNumId w:val="0"/>
   </w:num>
 </w:numbering>
 </file>

</xml_diff>